<commit_message>
docs: update report with project photos, simplified architecture diagram, and minimized appendix code
</commit_message>
<xml_diff>
--- a/docs/SMART_KNOWLEDGE_BASE_AGENT_REPORT_44110216.docx
+++ b/docs/SMART_KNOWLEDGE_BASE_AGENT_REPORT_44110216.docx
@@ -4291,7 +4291,7 @@
                 <w:b w:val="0"/>
                 <w:sz w:val="19"/>
               </w:rPr>
-              <w:t>Live Web Dashboard &amp; Interactive Q&amp;A Workspace (React + Vite + Tailwind v4)</w:t>
+              <w:t>Live Web Dashboard &amp; Interactive AI Agent Chat Workspace (Smart Knowledge Base Agent)</w:t>
             </w:r>
           </w:p>
         </w:tc>
@@ -4371,7 +4371,7 @@
                 <w:b w:val="0"/>
                 <w:sz w:val="19"/>
               </w:rPr>
-              <w:t>Side-by-Side Reading Desk View with Highlighted Source Document Citations</w:t>
+              <w:t>Knowledge Library &amp; Side-by-Side Reading Desk Citation View</w:t>
             </w:r>
           </w:p>
         </w:tc>
@@ -4451,7 +4451,7 @@
                 <w:b w:val="0"/>
                 <w:sz w:val="19"/>
               </w:rPr>
-              <w:t>Interactive Command Palette (Ctrl+K) for Instant Document and Action Navigation</w:t>
+              <w:t>Controls &amp; Settings Administration Panel (FastAPI, ChromaDB &amp; SQLite Health)</w:t>
             </w:r>
           </w:p>
         </w:tc>
@@ -10281,7 +10281,7 @@
           <w:sz w:val="23"/>
           <w:u w:val="none"/>
         </w:rPr>
-        <w:t>4.3.6 React/Vite/Tailwind v4 'Private Library' User Workspace</w:t>
+        <w:t>4.3.6 Streamlit Modern Web Dashboard &amp; Interactive AI Agent Chat Workspace</w:t>
       </w:r>
     </w:p>
     <w:p>
@@ -10353,7 +10353,7 @@
           <w:sz w:val="22"/>
           <w:u w:val="none"/>
         </w:rPr>
-        <w:t>Fig 4.2: Live Web Dashboard &amp; Interactive Q&amp;A Workspace (React + Vite + Tailwind v4)</w:t>
+        <w:t>Fig 4.2: Live Web Dashboard &amp; Interactive AI Agent Chat Workspace (Smart Knowledge Base Agent)</w:t>
       </w:r>
     </w:p>
     <w:p>
@@ -10425,7 +10425,7 @@
           <w:sz w:val="22"/>
           <w:u w:val="none"/>
         </w:rPr>
-        <w:t>Fig 4.3: Side-by-Side Reading Desk View with Highlighted Source Document Citations</w:t>
+        <w:t>Fig 4.3: Knowledge Library &amp; Side-by-Side Reading Desk Citation View</w:t>
       </w:r>
     </w:p>
     <w:p>
@@ -10497,7 +10497,7 @@
           <w:sz w:val="22"/>
           <w:u w:val="none"/>
         </w:rPr>
-        <w:t>Fig 4.4: Interactive Command Palette (Ctrl+K) for Instant Document and Action Navigation</w:t>
+        <w:t>Fig 4.4: Controls &amp; Settings Administration Panel (FastAPI, ChromaDB &amp; SQLite Health)</w:t>
       </w:r>
     </w:p>
     <w:p>
@@ -13781,51 +13781,34 @@
         </w:rPr>
         <w:t>class HybridRetriever:</w:t>
         <w:br/>
-        <w:t xml:space="preserve">    def __init__(self, vectorstore: VectorStore, embedder: EmbedderProtocol, rrf_k: int = 60):</w:t>
+        <w:t xml:space="preserve">    def __init__(self, vectorstore: VectorStore, embedder: Embedder, rrf_k: int = 60, threshold: float = 0.62):</w:t>
         <w:br/>
-        <w:t xml:space="preserve">        self.vectorstore = vectorstore</w:t>
-        <w:br/>
-        <w:t xml:space="preserve">        self.embedder = embedder</w:t>
-        <w:br/>
-        <w:t xml:space="preserve">        self.rrf_k = rrf_k</w:t>
-        <w:br/>
-        <w:t xml:space="preserve">        self.score_threshold = 0.62</w:t>
+        <w:t xml:space="preserve">        self.vectorstore, self.embedder, self.rrf_k, self.threshold = vectorstore, embedder, rrf_k, threshold</w:t>
         <w:br/>
         <w:br/>
-        <w:t xml:space="preserve">    def search(self, query: str, top_k: int = 5, mode: str = 'hybrid') -&gt; RetrievalResponse:</w:t>
+        <w:t xml:space="preserve">    def search(self, query: str, top_k: int = 5) -&gt; RetrievalResponse:</w:t>
         <w:br/>
-        <w:t xml:space="preserve">        # 1. Dense Vector Similarity Search</w:t>
-        <w:br/>
-        <w:t xml:space="preserve">        q_vec = self.embedder.embed(query)</w:t>
-        <w:br/>
-        <w:t xml:space="preserve">        dense_hits = self.vectorstore.query(q_vec, n_results=top_k * 2)</w:t>
-        <w:br/>
-        <w:br/>
-        <w:t xml:space="preserve">        # 2. Sparse Lexical Search (BM25Plus)</w:t>
+        <w:t xml:space="preserve">        dense_hits = self.vectorstore.query(self.embedder.embed(query), n_results=top_k * 2)</w:t>
         <w:br/>
         <w:t xml:space="preserve">        bm25_hits = self._bm25_search(query, n_results=top_k * 2)</w:t>
         <w:br/>
+        <w:t xml:space="preserve">        </w:t>
         <w:br/>
-        <w:t xml:space="preserve">        # 3. Reciprocal Rank Fusion (RRF k=60)</w:t>
+        <w:t xml:space="preserve">        # Reciprocal Rank Fusion (k=60)</w:t>
         <w:br/>
-        <w:t xml:space="preserve">        fused_scores = {}</w:t>
+        <w:t xml:space="preserve">        scores = {}</w:t>
         <w:br/>
-        <w:t xml:space="preserve">        for rank, hit in enumerate(dense_hits, start=1):</w:t>
+        <w:t xml:space="preserve">        for r, h in enumerate(dense_hits, 1): scores[h.id] = scores.get(h.id, 0.0) + 1.0 / (self.rrf_k + r)</w:t>
         <w:br/>
-        <w:t xml:space="preserve">            fused_scores[hit.id] = fused_scores.get(hit.id, 0.0) + (1.0 / (self.rrf_k + rank))</w:t>
+        <w:t xml:space="preserve">        for r, h in enumerate(bm25_hits, 1):  scores[h.id] = scores.get(h.id, 0.0) + 1.0 / (self.rrf_k + r)</w:t>
         <w:br/>
-        <w:t xml:space="preserve">        for rank, hit in enumerate(bm25_hits, start=1):</w:t>
+        <w:t xml:space="preserve">        </w:t>
         <w:br/>
-        <w:t xml:space="preserve">            fused_scores[hit.id] = fused_scores.get(hit.id, 0.0) + (1.0 / (self.rrf_k + rank))</w:t>
+        <w:t xml:space="preserve">        # Cosine confidence gate (threshold: 0.62)</w:t>
         <w:br/>
+        <w:t xml:space="preserve">        is_confident = max((h.similarity for h in dense_hits), default=0.0) &gt;= self.threshold</w:t>
         <w:br/>
-        <w:t xml:space="preserve">        # 4. Strict Confidence Assessment on Raw Cosine Similarity</w:t>
-        <w:br/>
-        <w:t xml:space="preserve">        max_cosine = max([h.similarity for h in dense_hits], default=0.0)</w:t>
-        <w:br/>
-        <w:t xml:space="preserve">        is_confident = (max_cosine &gt;= self.score_threshold)</w:t>
-        <w:br/>
-        <w:t xml:space="preserve">        ranked = sorted(fused_scores.items(), key=lambda x: x[1], reverse=True)[:top_k]</w:t>
+        <w:t xml:space="preserve">        ranked = sorted(scores.items(), key=lambda x: x[1], reverse=True)[:top_k]</w:t>
         <w:br/>
         <w:t xml:space="preserve">        return RetrievalResponse(results=ranked, confident=is_confident)</w:t>
       </w:r>
@@ -13874,36 +13857,26 @@
         </w:rPr>
         <w:t>class DocumentChangeHandler(FileSystemEventHandler):</w:t>
         <w:br/>
-        <w:t xml:space="preserve">    def __init__(self, db: MetadataDB, queue: queue.Queue, debounce_s: float = 0.5):</w:t>
+        <w:t xml:space="preserve">    def __init__(self, db: MetadataStore, queue: queue.Queue, debounce_s: float = 0.5):</w:t>
         <w:br/>
-        <w:t xml:space="preserve">        self.db = db</w:t>
-        <w:br/>
-        <w:t xml:space="preserve">        self.queue = queue</w:t>
-        <w:br/>
-        <w:t xml:space="preserve">        self.debounce_s = debounce_s</w:t>
-        <w:br/>
-        <w:t xml:space="preserve">        self._last_event = {}</w:t>
+        <w:t xml:space="preserve">        self.db, self.queue, self.debounce_s, self._last_event = db, queue, debounce_s, {}</w:t>
         <w:br/>
         <w:br/>
         <w:t xml:space="preserve">    def on_modified(self, event: FileSystemEvent):</w:t>
         <w:br/>
-        <w:t xml:space="preserve">        if event.is_directory or is_noise_file(event.src_path):</w:t>
-        <w:br/>
-        <w:t xml:space="preserve">            return</w:t>
+        <w:t xml:space="preserve">        if event.is_directory or is_noise_file(event.src_path): return</w:t>
         <w:br/>
         <w:t xml:space="preserve">        now = time.time()</w:t>
         <w:br/>
-        <w:t xml:space="preserve">        if now - self._last_event.get(event.src_path, 0) &lt; self.debounce_s:</w:t>
-        <w:br/>
-        <w:t xml:space="preserve">            return  # Debounce rapid burst writes</w:t>
+        <w:t xml:space="preserve">        if now - self._last_event.get(event.src_path, 0) &lt; self.debounce_s: return</w:t>
         <w:br/>
         <w:t xml:space="preserve">        self._last_event[event.src_path] = now</w:t>
         <w:br/>
+        <w:t xml:space="preserve">        </w:t>
+        <w:br/>
         <w:t xml:space="preserve">        new_hash = _compute_sha256(event.src_path)</w:t>
         <w:br/>
-        <w:t xml:space="preserve">        old_hash = self.db.get_file_hash(event.src_path)</w:t>
-        <w:br/>
-        <w:t xml:space="preserve">        if new_hash != old_hash:</w:t>
+        <w:t xml:space="preserve">        if new_hash != self.db.get_file_hash(event.src_path):</w:t>
         <w:br/>
         <w:t xml:space="preserve">            self.queue.put(('update', event.src_path, new_hash))</w:t>
         <w:br/>
@@ -13971,7 +13944,7 @@
           <w:rFonts w:ascii="Times New Roman" w:hAnsi="Times New Roman"/>
           <w:sz w:val="24"/>
         </w:rPr>
-        <w:t xml:space="preserve"> Start LM Studio -&gt; Load `google/gemma-4-e4b` (GGUF 4-bit) -&gt; Start Local Server on Port 1234 -&gt; CORS Enabled.</w:t>
+        <w:t xml:space="preserve"> Self-healing In-Process RAG Mode: Automatically loads without external commands if backend service is offline.</w:t>
       </w:r>
     </w:p>
     <w:p>
@@ -14001,7 +13974,7 @@
           <w:rFonts w:ascii="Times New Roman" w:hAnsi="Times New Roman"/>
           <w:sz w:val="24"/>
         </w:rPr>
-        <w:t xml:space="preserve"> `cd C:\SKBA\backend` -&gt; `.\.venv\Scripts\activate` -&gt; `uvicorn app.main:app --host 127.0.0.1 --port 8000 --reload`</w:t>
+        <w:t xml:space="preserve"> Start Backend API Server (Port 8000): `python main.py` or `uvicorn src.api.main:app --port 8000 --reload`</w:t>
       </w:r>
     </w:p>
     <w:p>
@@ -14031,7 +14004,7 @@
           <w:rFonts w:ascii="Times New Roman" w:hAnsi="Times New Roman"/>
           <w:sz w:val="24"/>
         </w:rPr>
-        <w:t xml:space="preserve"> `cd C:\SKBA\frontend` -&gt; `npm install` -&gt; `npm run dev` -&gt; Navigate browser to `http://localhost:5173`</w:t>
+        <w:t xml:space="preserve"> Start Frontend Web Application (Port 8501): `streamlit run src/ui/app.py`</w:t>
       </w:r>
     </w:p>
     <w:sectPr>

</xml_diff>